<commit_message>
chore(release-0.1.1): version bump + test report refresh
- Versions 0.1.0 -> 0.1.1: pyproject, workspace Cargo (+lock),
  Chart version/appVersion, openapi info, SERVICE_DESCRIPTION.
- TEST_REPORT: recount 279 (188 py + 91 rust), per-module numbers,
  new section 6 (0.1.1 cycle); TEST_REPORT.docx regenerated.
</commit_message>
<xml_diff>
--- a/docs/TEST_REPORT.docx
+++ b/docs/TEST_REPORT.docx
@@ -2,7 +2,7 @@
 <file path=word/document.xml><?xml version="1.0" encoding="utf-8"?>
 <w:document xmlns:w="http://schemas.openxmlformats.org/wordprocessingml/2006/main" xmlns:m="http://schemas.openxmlformats.org/officeDocument/2006/math" xmlns:r="http://schemas.openxmlformats.org/officeDocument/2006/relationships" xmlns:o="urn:schemas-microsoft-com:office:office" xmlns:v="urn:schemas-microsoft-com:vml" xmlns:w10="urn:schemas-microsoft-com:office:word" xmlns:a="http://schemas.openxmlformats.org/drawingml/2006/main" xmlns:pic="http://schemas.openxmlformats.org/drawingml/2006/picture" xmlns:wp="http://schemas.openxmlformats.org/drawingml/2006/wordprocessingDrawing">
   <w:body>
-    <w:bookmarkStart w:id="25" w:name="итоговый-отчёт-по-тестам-firewall-llm"/>
+    <w:bookmarkStart w:id="26" w:name="итоговый-отчёт-по-тестам-firewall-llm"/>
     <w:p>
       <w:pPr>
         <w:pStyle w:val="Heading1"/>
@@ -26,7 +26,7 @@
         <w:t xml:space="preserve"> </w:t>
       </w:r>
       <w:r>
-        <w:t xml:space="preserve">2026-09-06 (обновлён после цикла релизных исправлений R01–R16) ·</w:t>
+        <w:t xml:space="preserve">2026-09-06 (обновлён под 0.1.1) ·</w:t>
       </w:r>
       <w:r>
         <w:t xml:space="preserve"> </w:t>
@@ -58,7 +58,7 @@
         <w:t xml:space="preserve"> </w:t>
       </w:r>
       <w:r>
-        <w:t xml:space="preserve">263 теста (182 Python + 81 Rust), 1 live (пропущен без ключа)</w:t>
+        <w:t xml:space="preserve">279 тестов (188 Python + 91 Rust), 1 live (пропущен без ключа)</w:t>
       </w:r>
     </w:p>
     <w:p>
@@ -66,7 +66,7 @@
         <w:pStyle w:val="BodyText"/>
       </w:pPr>
       <w:r>
-        <w:t xml:space="preserve">Исходная версия от 2026-08-26 — 181 тест (144 + 37). Дельта +82 — цикл R01–R16, см. §5.</w:t>
+        <w:t xml:space="preserve">Исходная версия от 2026-08-26 — 181 тест (144 + 37). Дельта +98: цикл R01–R16 (см. §5) и цикл 0.1.1 (см. §6).</w:t>
       </w:r>
     </w:p>
     <w:p>
@@ -483,7 +483,7 @@
               <w:pStyle w:val="Compact"/>
             </w:pPr>
             <w:r>
-              <w:t xml:space="preserve">18</w:t>
+              <w:t xml:space="preserve">19</w:t>
             </w:r>
           </w:p>
         </w:tc>
@@ -916,18 +916,18 @@
               <w:t xml:space="preserve"> </w:t>
             </w:r>
             <w:r>
-              <w:t xml:space="preserve">(5)</w:t>
-            </w:r>
-          </w:p>
-        </w:tc>
-        <w:tc>
-          <w:tcPr/>
-          <w:p>
-            <w:pPr>
-              <w:pStyle w:val="Compact"/>
-            </w:pPr>
-            <w:r>
-              <w:t xml:space="preserve">7</w:t>
+              <w:t xml:space="preserve">(6)</w:t>
+            </w:r>
+          </w:p>
+        </w:tc>
+        <w:tc>
+          <w:tcPr/>
+          <w:p>
+            <w:pPr>
+              <w:pStyle w:val="Compact"/>
+            </w:pPr>
+            <w:r>
+              <w:t xml:space="preserve">8</w:t>
             </w:r>
           </w:p>
         </w:tc>
@@ -1048,7 +1048,7 @@
               <w:t xml:space="preserve"> </w:t>
             </w:r>
             <w:r>
-              <w:t xml:space="preserve">(16),</w:t>
+              <w:t xml:space="preserve">(17),</w:t>
             </w:r>
             <w:r>
               <w:t xml:space="preserve"> </w:t>
@@ -1074,7 +1074,7 @@
               <w:pStyle w:val="Compact"/>
             </w:pPr>
             <w:r>
-              <w:t xml:space="preserve">20</w:t>
+              <w:t xml:space="preserve">21</w:t>
             </w:r>
           </w:p>
         </w:tc>
@@ -1194,7 +1194,7 @@
               <w:pStyle w:val="Compact"/>
             </w:pPr>
             <w:r>
-              <w:t xml:space="preserve">7</w:t>
+              <w:t xml:space="preserve">8</w:t>
             </w:r>
           </w:p>
         </w:tc>
@@ -1327,7 +1327,7 @@
               <w:t xml:space="preserve"> </w:t>
             </w:r>
             <w:r>
-              <w:t xml:space="preserve">(10),</w:t>
+              <w:t xml:space="preserve">(11),</w:t>
             </w:r>
             <w:r>
               <w:t xml:space="preserve"> </w:t>
@@ -1398,7 +1398,7 @@
               <w:pStyle w:val="Compact"/>
             </w:pPr>
             <w:r>
-              <w:t xml:space="preserve">23</w:t>
+              <w:t xml:space="preserve">24</w:t>
             </w:r>
           </w:p>
         </w:tc>
@@ -1558,7 +1558,7 @@
               <w:t xml:space="preserve"> </w:t>
             </w:r>
             <w:r>
-              <w:t xml:space="preserve">(5),</w:t>
+              <w:t xml:space="preserve">(6),</w:t>
             </w:r>
             <w:r>
               <w:t xml:space="preserve"> </w:t>
@@ -1584,7 +1584,7 @@
               <w:pStyle w:val="Compact"/>
             </w:pPr>
             <w:r>
-              <w:t xml:space="preserve">12</w:t>
+              <w:t xml:space="preserve">13</w:t>
             </w:r>
           </w:p>
         </w:tc>
@@ -2059,7 +2059,7 @@
               <w:t xml:space="preserve"> </w:t>
             </w:r>
             <w:r>
-              <w:t xml:space="preserve">unit (3),</w:t>
+              <w:t xml:space="preserve">unit (4),</w:t>
             </w:r>
             <w:r>
               <w:t xml:space="preserve"> </w:t>
@@ -2071,18 +2071,18 @@
               <w:t xml:space="preserve">fwllm-gateway/tests/</w:t>
             </w:r>
             <w:r>
-              <w:t xml:space="preserve">: audit (5), egress (6), gateway (25), ingress (7), inspectors (3), lifecycle (5, R12), metering (9)</w:t>
-            </w:r>
-          </w:p>
-        </w:tc>
-        <w:tc>
-          <w:tcPr/>
-          <w:p>
-            <w:pPr>
-              <w:pStyle w:val="Compact"/>
-            </w:pPr>
-            <w:r>
-              <w:t xml:space="preserve">74</w:t>
+              <w:t xml:space="preserve">: audit (6), egress (7), gateway (25), ingress (7), inspectors (5), lifecycle (5, R12), metering (9)</w:t>
+            </w:r>
+          </w:p>
+        </w:tc>
+        <w:tc>
+          <w:tcPr/>
+          <w:p>
+            <w:pPr>
+              <w:pStyle w:val="Compact"/>
+            </w:pPr>
+            <w:r>
+              <w:t xml:space="preserve">79</w:t>
             </w:r>
           </w:p>
         </w:tc>
@@ -2224,18 +2224,33 @@
               <w:t xml:space="preserve"> </w:t>
             </w:r>
             <w:r>
-              <w:t xml:space="preserve">(4, R09)</w:t>
-            </w:r>
-          </w:p>
-        </w:tc>
-        <w:tc>
-          <w:tcPr/>
-          <w:p>
-            <w:pPr>
-              <w:pStyle w:val="Compact"/>
-            </w:pPr>
-            <w:r>
-              <w:t xml:space="preserve">7</w:t>
+              <w:t xml:space="preserve">(5, R09),</w:t>
+            </w:r>
+            <w:r>
+              <w:t xml:space="preserve"> </w:t>
+            </w:r>
+            <w:r>
+              <w:rPr>
+                <w:rStyle w:val="VerbatimChar"/>
+              </w:rPr>
+              <w:t xml:space="preserve">ingress_hardening_test.rs</w:t>
+            </w:r>
+            <w:r>
+              <w:t xml:space="preserve"> </w:t>
+            </w:r>
+            <w:r>
+              <w:t xml:space="preserve">(4)</w:t>
+            </w:r>
+          </w:p>
+        </w:tc>
+        <w:tc>
+          <w:tcPr/>
+          <w:p>
+            <w:pPr>
+              <w:pStyle w:val="Compact"/>
+            </w:pPr>
+            <w:r>
+              <w:t xml:space="preserve">12</w:t>
             </w:r>
           </w:p>
         </w:tc>
@@ -2464,7 +2479,7 @@
         <w:t xml:space="preserve"> </w:t>
       </w:r>
       <w:r>
-        <w:t xml:space="preserve">182 (+1 live</w:t>
+        <w:t xml:space="preserve">188 (+1 live</w:t>
       </w:r>
       <w:r>
         <w:t xml:space="preserve"> </w:t>
@@ -2492,7 +2507,7 @@
         <w:t xml:space="preserve"> </w:t>
       </w:r>
       <w:r>
-        <w:t xml:space="preserve">81 (74 №13 + 7 №14).</w:t>
+        <w:t xml:space="preserve">91 (79 №13 + 12 №14).</w:t>
       </w:r>
       <w:r>
         <w:t xml:space="preserve"> </w:t>
@@ -2502,7 +2517,7 @@
           <w:b/>
           <w:bCs/>
         </w:rPr>
-        <w:t xml:space="preserve">Всего: 263.</w:t>
+        <w:t xml:space="preserve">Всего: 279.</w:t>
       </w:r>
     </w:p>
     <w:p>
@@ -2685,6 +2700,107 @@
               <w:pStyle w:val="Compact"/>
             </w:pPr>
             <w:r>
+              <w:t xml:space="preserve">R02 live (2026-09-06)</w:t>
+            </w:r>
+          </w:p>
+        </w:tc>
+        <w:tc>
+          <w:tcPr/>
+          <w:p>
+            <w:pPr>
+              <w:pStyle w:val="Compact"/>
+            </w:pPr>
+            <w:r>
+              <w:t xml:space="preserve">SOCKS-зависимости обеих веток (</w:t>
+            </w:r>
+            <w:r>
+              <w:rPr>
+                <w:rStyle w:val="VerbatimChar"/>
+              </w:rPr>
+              <w:t xml:space="preserve">httpx[socks]</w:t>
+            </w:r>
+            <w:r>
+              <w:t xml:space="preserve">, reqwest</w:t>
+            </w:r>
+            <w:r>
+              <w:t xml:space="preserve"> </w:t>
+            </w:r>
+            <w:r>
+              <w:rPr>
+                <w:rStyle w:val="VerbatimChar"/>
+              </w:rPr>
+              <w:t xml:space="preserve">socks</w:t>
+            </w:r>
+            <w:r>
+              <w:t xml:space="preserve">) + SOCKS round-trip unit; живые чаты</w:t>
+            </w:r>
+            <w:r>
+              <w:t xml:space="preserve"> </w:t>
+            </w:r>
+            <w:r>
+              <w:rPr>
+                <w:rStyle w:val="VerbatimChar"/>
+              </w:rPr>
+              <w:t xml:space="preserve">gpt-4o-mini</w:t>
+            </w:r>
+            <w:r>
+              <w:t xml:space="preserve"> </w:t>
+            </w:r>
+            <w:r>
+              <w:t xml:space="preserve">через</w:t>
+            </w:r>
+            <w:r>
+              <w:t xml:space="preserve"> </w:t>
+            </w:r>
+            <w:r>
+              <w:rPr>
+                <w:rStyle w:val="VerbatimChar"/>
+              </w:rPr>
+              <w:t xml:space="preserve">single_proxy</w:t>
+            </w:r>
+            <w:r>
+              <w:t xml:space="preserve"> </w:t>
+            </w:r>
+            <w:r>
+              <w:t xml:space="preserve">socks5h на dev-server — 200 в обеих ветках (dev-server IP заблокирован OpenRouter напрямую 403, метод проверки: оракул</w:t>
+            </w:r>
+            <w:r>
+              <w:t xml:space="preserve"> </w:t>
+            </w:r>
+            <w:r>
+              <w:rPr>
+                <w:rStyle w:val="VerbatimChar"/>
+              </w:rPr>
+              <w:t xml:space="preserve">/auth/key</w:t>
+            </w:r>
+            <w:r>
+              <w:t xml:space="preserve"> </w:t>
+            </w:r>
+            <w:r>
+              <w:t xml:space="preserve">401 vs 403; рабочий exit найден среди публичных SOCKS, без секретов)</w:t>
+            </w:r>
+          </w:p>
+        </w:tc>
+        <w:tc>
+          <w:tcPr/>
+          <w:p>
+            <w:pPr>
+              <w:pStyle w:val="Compact"/>
+            </w:pPr>
+            <w:r>
+              <w:t xml:space="preserve">✅</w:t>
+            </w:r>
+          </w:p>
+        </w:tc>
+      </w:tr>
+      <w:tr>
+        <w:tc>
+          <w:tcPr/>
+          <w:p>
+            <w:pPr>
+              <w:pStyle w:val="Compact"/>
+            </w:pPr>
+            <w:r>
               <w:t xml:space="preserve">R03 stream без usage</w:t>
             </w:r>
           </w:p>
@@ -4227,8 +4343,321 @@
         <w:t xml:space="preserve">для обеих веток.</w:t>
       </w:r>
     </w:p>
+    <w:p>
+      <w:r>
+        <w:pict>
+          <v:rect style="width:0;height:1.5pt" o:hralign="center" o:hrstd="t" o:hr="t"/>
+        </w:pict>
+      </w:r>
+    </w:p>
     <w:bookmarkEnd w:id="24"/>
+    <w:bookmarkStart w:id="25" w:name="цикл-0.1.1-2026-09-06-после-v0.1.0"/>
+    <w:p>
+      <w:pPr>
+        <w:pStyle w:val="Heading2"/>
+      </w:pPr>
+      <w:r>
+        <w:t xml:space="preserve">6. Цикл 0.1.1 (2026-09-06, после v0.1.0)</w:t>
+      </w:r>
+    </w:p>
+    <w:tbl>
+      <w:tblPr>
+        <w:tblStyle w:val="Table"/>
+        <w:tblW w:type="pct" w:w="5000"/>
+        <w:tblLayout w:type="fixed"/>
+        <w:tblLook w:firstRow="1" w:lastRow="0" w:firstColumn="0" w:lastColumn="0" w:noHBand="0" w:noVBand="0" w:val="0020"/>
+      </w:tblPr>
+      <w:tblGrid>
+        <w:gridCol w:w="2640"/>
+        <w:gridCol w:w="2640"/>
+        <w:gridCol w:w="2640"/>
+      </w:tblGrid>
+      <w:tr>
+        <w:trPr>
+          <w:tblHeader w:val="on"/>
+        </w:trPr>
+        <w:tc>
+          <w:tcPr/>
+          <w:p>
+            <w:pPr>
+              <w:pStyle w:val="Compact"/>
+            </w:pPr>
+            <w:r>
+              <w:t xml:space="preserve">Направление</w:t>
+            </w:r>
+          </w:p>
+        </w:tc>
+        <w:tc>
+          <w:tcPr/>
+          <w:p>
+            <w:pPr>
+              <w:pStyle w:val="Compact"/>
+            </w:pPr>
+            <w:r>
+              <w:t xml:space="preserve">Ключевые новые тесты</w:t>
+            </w:r>
+          </w:p>
+        </w:tc>
+        <w:tc>
+          <w:tcPr/>
+          <w:p>
+            <w:pPr>
+              <w:pStyle w:val="Compact"/>
+            </w:pPr>
+            <w:r>
+              <w:t xml:space="preserve">Статус</w:t>
+            </w:r>
+          </w:p>
+        </w:tc>
+      </w:tr>
+      <w:tr>
+        <w:tc>
+          <w:tcPr/>
+          <w:p>
+            <w:pPr>
+              <w:pStyle w:val="Compact"/>
+            </w:pPr>
+            <w:r>
+              <w:t xml:space="preserve">Capacity: WAL-аудит</w:t>
+            </w:r>
+          </w:p>
+        </w:tc>
+        <w:tc>
+          <w:tcPr/>
+          <w:p>
+            <w:pPr>
+              <w:pStyle w:val="Compact"/>
+            </w:pPr>
+            <w:r>
+              <w:t xml:space="preserve">journal mode/busy_timeout в обеих ветках</w:t>
+            </w:r>
+          </w:p>
+        </w:tc>
+        <w:tc>
+          <w:tcPr/>
+          <w:p>
+            <w:pPr>
+              <w:pStyle w:val="Compact"/>
+            </w:pPr>
+            <w:r>
+              <w:t xml:space="preserve">✅</w:t>
+            </w:r>
+          </w:p>
+        </w:tc>
+      </w:tr>
+      <w:tr>
+        <w:tc>
+          <w:tcPr/>
+          <w:p>
+            <w:pPr>
+              <w:pStyle w:val="Compact"/>
+            </w:pPr>
+            <w:r>
+              <w:t xml:space="preserve">Capacity: workers + multiproc</w:t>
+            </w:r>
+          </w:p>
+        </w:tc>
+        <w:tc>
+          <w:tcPr/>
+          <w:p>
+            <w:pPr>
+              <w:pStyle w:val="Compact"/>
+            </w:pPr>
+            <w:r>
+              <w:t xml:space="preserve">multiproc-рендер через субпроцесс; guard 429 при saturation (blocking provider)</w:t>
+            </w:r>
+          </w:p>
+        </w:tc>
+        <w:tc>
+          <w:tcPr/>
+          <w:p>
+            <w:pPr>
+              <w:pStyle w:val="Compact"/>
+            </w:pPr>
+            <w:r>
+              <w:t xml:space="preserve">✅</w:t>
+            </w:r>
+          </w:p>
+        </w:tc>
+      </w:tr>
+      <w:tr>
+        <w:tc>
+          <w:tcPr/>
+          <w:p>
+            <w:pPr>
+              <w:pStyle w:val="Compact"/>
+            </w:pPr>
+            <w:r>
+              <w:t xml:space="preserve">Capacity: guard</w:t>
+            </w:r>
+          </w:p>
+        </w:tc>
+        <w:tc>
+          <w:tcPr/>
+          <w:p>
+            <w:pPr>
+              <w:pStyle w:val="Compact"/>
+            </w:pPr>
+            <w:r>
+              <w:t xml:space="preserve">429 вместо очереди (см. выше)</w:t>
+            </w:r>
+          </w:p>
+        </w:tc>
+        <w:tc>
+          <w:tcPr/>
+          <w:p>
+            <w:pPr>
+              <w:pStyle w:val="Compact"/>
+            </w:pPr>
+            <w:r>
+              <w:t xml:space="preserve">✅</w:t>
+            </w:r>
+          </w:p>
+        </w:tc>
+      </w:tr>
+      <w:tr>
+        <w:tc>
+          <w:tcPr/>
+          <w:p>
+            <w:pPr>
+              <w:pStyle w:val="Compact"/>
+            </w:pPr>
+            <w:r>
+              <w:t xml:space="preserve">DLP-паритет Rust</w:t>
+            </w:r>
+          </w:p>
+        </w:tc>
+        <w:tc>
+          <w:tcPr/>
+          <w:p>
+            <w:pPr>
+              <w:pStyle w:val="Compact"/>
+            </w:pPr>
+            <w:r>
+              <w:t xml:space="preserve">корпус 12 сэмплов в обеих ветках; email-vs-handle ordering; generic mask labels</w:t>
+            </w:r>
+          </w:p>
+        </w:tc>
+        <w:tc>
+          <w:tcPr/>
+          <w:p>
+            <w:pPr>
+              <w:pStyle w:val="Compact"/>
+            </w:pPr>
+            <w:r>
+              <w:t xml:space="preserve">✅</w:t>
+            </w:r>
+          </w:p>
+        </w:tc>
+      </w:tr>
+      <w:tr>
+        <w:tc>
+          <w:tcPr/>
+          <w:p>
+            <w:pPr>
+              <w:pStyle w:val="Compact"/>
+            </w:pPr>
+            <w:r>
+              <w:t xml:space="preserve">Tunnel hardening</w:t>
+            </w:r>
+          </w:p>
+        </w:tc>
+        <w:tc>
+          <w:tcPr/>
+          <w:p>
+            <w:pPr>
+              <w:pStyle w:val="Compact"/>
+            </w:pPr>
+            <w:r>
+              <w:t xml:space="preserve">unregister/sweep/bounded/heartbeat-liveness/backoff unit; reconnect на настоящем бинарнике</w:t>
+            </w:r>
+          </w:p>
+        </w:tc>
+        <w:tc>
+          <w:tcPr/>
+          <w:p>
+            <w:pPr>
+              <w:pStyle w:val="Compact"/>
+            </w:pPr>
+            <w:r>
+              <w:t xml:space="preserve">✅</w:t>
+            </w:r>
+          </w:p>
+        </w:tc>
+      </w:tr>
+      <w:tr>
+        <w:tc>
+          <w:tcPr/>
+          <w:p>
+            <w:pPr>
+              <w:pStyle w:val="Compact"/>
+            </w:pPr>
+            <w:r>
+              <w:t xml:space="preserve">Async backends</w:t>
+            </w:r>
+          </w:p>
+        </w:tc>
+        <w:tc>
+          <w:tcPr/>
+          <w:p>
+            <w:pPr>
+              <w:pStyle w:val="Compact"/>
+            </w:pPr>
+            <w:r>
+              <w:t xml:space="preserve">metering suite на tokio (concurrency через задачи); thread-safety PolicyEngine; disconnect-poll в lifecycle-тесте</w:t>
+            </w:r>
+          </w:p>
+        </w:tc>
+        <w:tc>
+          <w:tcPr/>
+          <w:p>
+            <w:pPr>
+              <w:pStyle w:val="Compact"/>
+            </w:pPr>
+            <w:r>
+              <w:t xml:space="preserve">✅</w:t>
+            </w:r>
+          </w:p>
+        </w:tc>
+      </w:tr>
+      <w:tr>
+        <w:tc>
+          <w:tcPr/>
+          <w:p>
+            <w:pPr>
+              <w:pStyle w:val="Compact"/>
+            </w:pPr>
+            <w:r>
+              <w:t xml:space="preserve">SOCKS egress</w:t>
+            </w:r>
+          </w:p>
+        </w:tc>
+        <w:tc>
+          <w:tcPr/>
+          <w:p>
+            <w:pPr>
+              <w:pStyle w:val="Compact"/>
+            </w:pPr>
+            <w:r>
+              <w:t xml:space="preserve">SOCKS round-trip через мини-прокси (Rust); construction-тест (Python); живые чаты обеих веток</w:t>
+            </w:r>
+          </w:p>
+        </w:tc>
+        <w:tc>
+          <w:tcPr/>
+          <w:p>
+            <w:pPr>
+              <w:pStyle w:val="Compact"/>
+            </w:pPr>
+            <w:r>
+              <w:t xml:space="preserve">✅</w:t>
+            </w:r>
+          </w:p>
+        </w:tc>
+      </w:tr>
+    </w:tbl>
     <w:bookmarkEnd w:id="25"/>
+    <w:bookmarkEnd w:id="26"/>
     <w:sectPr>
       <w:footnotePr>
         <w:numRestart w:val="eachSect"/>

</xml_diff>